<commit_message>
Docs: the Word documents brought in line with the corrected report
The analytics document names "the two models alone" correctly and says
that figures for made-up products are before the correction step. The
guide says the same. The update document lists the two parts of the first
untested case that had no line (an end-of-day count, receiving an order).

Co-Authored-By: Claude Opus 5.5 <noreply@anthropic.com>
</commit_message>
<xml_diff>
--- a/QA/FETCH-Analytics-Explanation-and-Computation.docx
+++ b/QA/FETCH-Analytics-Explanation-and-Computation.docx
@@ -21169,7 +21169,7 @@
                 <w:sz w:val="20"/>
                 <w:szCs w:val="20"/>
               </w:rPr>
-              <w:t xml:space="preserve">The two models, before the correction</w:t>
+              <w:t xml:space="preserve">The two models alone</w:t>
             </w:r>
           </w:p>
         </w:tc>
@@ -24273,6 +24273,17 @@
           <w:szCs w:val="36"/>
         </w:rPr>
         <w:t xml:space="preserve">14. What the computation cannot do</w:t>
+      </w:r>
+    </w:p>
+    <w:p>
+      <w:pPr>
+        <w:spacing w:after="120" w:line="288"/>
+      </w:pPr>
+      <w:r>
+        <w:rPr>
+          <w:rFonts w:ascii="Calibri" w:cs="Calibri" w:eastAsia="Calibri" w:hAnsi="Calibri"/>
+        </w:rPr>
+        <w:t xml:space="preserve">Figures for made-up products in this section are the forecast before the correction step (section 9), which would then multiply each by its category's factor.</w:t>
       </w:r>
     </w:p>
     <w:tbl>

</xml_diff>